<commit_message>
Update SSB form generation and validation
</commit_message>
<xml_diff>
--- a/backend/api/form_processes/templates/pr_qua_20_104E.docx
+++ b/backend/api/form_processes/templates/pr_qua_20_104E.docx
@@ -38,6 +38,7 @@
       <w:tr>
         <w:trPr>
           <w:trHeight w:val="373"/>
+          <w:cantSplit/>
         </w:trPr>
         <w:tc>
           <w:tcPr>
@@ -119,12 +120,21 @@
                 <w:color w:val="000000"/>
               </w:rPr>
             </w:pPr>
+            <w:r>
+              <w:rPr>
+                <w:rFonts w:ascii="Arial" w:hAnsi="Arial"/>
+                <w:sz w:val="22"/>
+                <w:color w:val="000000"/>
+              </w:rPr>
+              <w:t>{{ contract_number }}</w:t>
+            </w:r>
           </w:p>
         </w:tc>
       </w:tr>
       <w:tr>
         <w:trPr>
           <w:trHeight w:val="373"/>
+          <w:cantSplit/>
         </w:trPr>
         <w:tc>
           <w:tcPr>
@@ -206,12 +216,21 @@
                 <w:color w:val="000000"/>
               </w:rPr>
             </w:pPr>
+            <w:r>
+              <w:rPr>
+                <w:rFonts w:ascii="Arial" w:hAnsi="Arial"/>
+                <w:sz w:val="22"/>
+                <w:color w:val="000000"/>
+              </w:rPr>
+              <w:t>{{ applicant }}</w:t>
+            </w:r>
           </w:p>
         </w:tc>
       </w:tr>
       <w:tr>
         <w:trPr>
           <w:trHeight w:val="373"/>
+          <w:cantSplit/>
         </w:trPr>
         <w:tc>
           <w:tcPr>
@@ -322,14 +341,21 @@
                 <w:color w:val="000000"/>
               </w:rPr>
             </w:pPr>
-            <w:bookmarkStart w:id="0" w:name="_GoBack"/>
-            <w:bookmarkEnd w:id="0"/>
+            <w:r>
+              <w:rPr>
+                <w:rFonts w:ascii="Arial" w:hAnsi="Arial"/>
+                <w:sz w:val="22"/>
+                <w:color w:val="000000"/>
+              </w:rPr>
+              <w:t>{{ application_number }}</w:t>
+            </w:r>
           </w:p>
         </w:tc>
       </w:tr>
       <w:tr>
         <w:trPr>
           <w:trHeight w:val="554"/>
+          <w:cantSplit/>
         </w:trPr>
         <w:tc>
           <w:tcPr>
@@ -490,12 +516,21 @@
                 <w:color w:val="000000"/>
               </w:rPr>
             </w:pPr>
+            <w:r>
+              <w:rPr>
+                <w:rFonts w:ascii="Arial" w:hAnsi="Arial"/>
+                <w:sz w:val="22"/>
+                <w:color w:val="000000"/>
+              </w:rPr>
+              <w:t>{{ nationality_marks_display }}</w:t>
+            </w:r>
           </w:p>
         </w:tc>
       </w:tr>
       <w:tr>
         <w:trPr>
           <w:trHeight w:val="373"/>
+          <w:cantSplit/>
         </w:trPr>
         <w:tc>
           <w:tcPr>
@@ -587,12 +622,21 @@
                 <w:color w:val="000000"/>
               </w:rPr>
             </w:pPr>
+            <w:r>
+              <w:rPr>
+                <w:rFonts w:ascii="Arial" w:hAnsi="Arial"/>
+                <w:sz w:val="22"/>
+                <w:color w:val="000000"/>
+              </w:rPr>
+              <w:t>{{ aircraft_owner }}</w:t>
+            </w:r>
           </w:p>
         </w:tc>
       </w:tr>
       <w:tr>
         <w:trPr>
           <w:trHeight w:val="373"/>
+          <w:cantSplit/>
         </w:trPr>
         <w:tc>
           <w:tcPr>
@@ -773,12 +817,21 @@
                 <w:color w:val="000000"/>
               </w:rPr>
             </w:pPr>
+            <w:r>
+              <w:rPr>
+                <w:rFonts w:ascii="Arial" w:hAnsi="Arial"/>
+                <w:sz w:val="22"/>
+                <w:color w:val="000000"/>
+              </w:rPr>
+              <w:t>{{ manufacturer_type_display }}</w:t>
+            </w:r>
           </w:p>
         </w:tc>
       </w:tr>
       <w:tr>
         <w:trPr>
           <w:trHeight w:val="373"/>
+          <w:cantSplit/>
         </w:trPr>
         <w:tc>
           <w:tcPr>
@@ -879,12 +932,21 @@
                 <w:color w:val="000000"/>
               </w:rPr>
             </w:pPr>
+            <w:r>
+              <w:rPr>
+                <w:rFonts w:ascii="Arial" w:hAnsi="Arial"/>
+                <w:sz w:val="22"/>
+                <w:color w:val="000000"/>
+              </w:rPr>
+              <w:t>{{ serial_number }}</w:t>
+            </w:r>
           </w:p>
         </w:tc>
       </w:tr>
       <w:tr>
         <w:trPr>
           <w:trHeight w:val="373"/>
+          <w:cantSplit/>
         </w:trPr>
         <w:tc>
           <w:tcPr>
@@ -966,6 +1028,14 @@
                 <w:color w:val="000000"/>
               </w:rPr>
             </w:pPr>
+            <w:r>
+              <w:rPr>
+                <w:rFonts w:ascii="Arial" w:hAnsi="Arial"/>
+                <w:sz w:val="22"/>
+                <w:color w:val="000000"/>
+              </w:rPr>
+              <w:t>{{ flight_date_duration_display }}</w:t>
+            </w:r>
           </w:p>
         </w:tc>
       </w:tr>
@@ -1065,6 +1135,14 @@
                 <w:bCs/>
               </w:rPr>
             </w:pPr>
+            <w:r>
+              <w:rPr>
+                <w:rFonts w:ascii="Arial" w:hAnsi="Arial"/>
+                <w:sz w:val="22"/>
+                <w:color w:val="000000"/>
+              </w:rPr>
+              <w:t>{{ purpose_display }}</w:t>
+            </w:r>
           </w:p>
         </w:tc>
       </w:tr>
@@ -1185,6 +1263,14 @@
                 <w:color w:val="000000"/>
               </w:rPr>
             </w:pPr>
+            <w:r>
+              <w:rPr>
+                <w:rFonts w:ascii="Arial" w:hAnsi="Arial"/>
+                <w:sz w:val="22"/>
+                <w:color w:val="000000"/>
+              </w:rPr>
+              <w:t>{{ aircraft_configuration }}</w:t>
+            </w:r>
           </w:p>
         </w:tc>
       </w:tr>
@@ -1306,6 +1392,14 @@
                 <w:szCs w:val="20"/>
               </w:rPr>
             </w:pPr>
+            <w:r>
+              <w:rPr>
+                <w:rFonts w:ascii="Arial" w:hAnsi="Arial"/>
+                <w:sz w:val="22"/>
+                <w:color w:val="000000"/>
+              </w:rPr>
+              <w:t>{{ conditions_restrictions }}</w:t>
+            </w:r>
           </w:p>
         </w:tc>
       </w:tr>
@@ -1467,6 +1561,14 @@
                 <w:szCs w:val="20"/>
               </w:rPr>
             </w:pPr>
+            <w:r>
+              <w:rPr>
+                <w:rFonts w:ascii="Arial" w:hAnsi="Arial"/>
+                <w:sz w:val="22"/>
+                <w:color w:val="000000"/>
+              </w:rPr>
+              <w:t>{{ substantiations }}</w:t>
+            </w:r>
           </w:p>
         </w:tc>
       </w:tr>
@@ -1614,6 +1716,7 @@
       <w:tr>
         <w:trPr>
           <w:trHeight w:val="579"/>
+          <w:cantSplit/>
         </w:trPr>
         <w:tc>
           <w:tcPr>
@@ -1736,12 +1839,21 @@
                 <w:szCs w:val="20"/>
               </w:rPr>
             </w:pPr>
+            <w:r>
+              <w:rPr>
+                <w:rFonts w:ascii="Arial" w:hAnsi="Arial"/>
+                <w:sz w:val="22"/>
+                <w:color w:val="000000"/>
+              </w:rPr>
+              <w:t>{{ issue_date_display }}</w:t>
+            </w:r>
           </w:p>
         </w:tc>
       </w:tr>
       <w:tr>
         <w:trPr>
           <w:trHeight w:val="1731"/>
+          <w:cantSplit/>
         </w:trPr>
         <w:tc>
           <w:tcPr>
@@ -1864,12 +1976,21 @@
                 <w:szCs w:val="20"/>
               </w:rPr>
             </w:pPr>
+            <w:r>
+              <w:rPr>
+                <w:rFonts w:ascii="Arial" w:hAnsi="Arial"/>
+                <w:sz w:val="22"/>
+                <w:color w:val="000000"/>
+              </w:rPr>
+              <w:t>{{ approver_name }}</w:t>
+            </w:r>
           </w:p>
         </w:tc>
       </w:tr>
       <w:tr>
         <w:trPr>
-          <w:trHeight w:val="737"/>
+          <w:trHeight w:val="600" w:hRule="atLeast"/>
+          <w:cantSplit/>
         </w:trPr>
         <w:tc>
           <w:tcPr>
@@ -2006,6 +2127,7 @@
                 <w:rFonts w:asciiTheme="minorHAnsi" w:hAnsiTheme="minorHAnsi" w:cs="Arial"/>
                 <w:bCs/>
                 <w:color w:val="000000"/>
+                <w:sz w:val="20"/>
               </w:rPr>
               <w:t>Başkan</w:t>
             </w:r>
@@ -2031,12 +2153,11 @@
             </w:pPr>
             <w:r>
               <w:rPr>
-                <w:rFonts w:asciiTheme="minorHAnsi" w:hAnsiTheme="minorHAnsi" w:cs="Arial"/>
-                <w:bCs/>
-                <w:i/>
-                <w:color w:val="008000"/>
-              </w:rPr>
-              <w:t>Ad Soyad</w:t>
+                <w:rFonts w:ascii="Arial" w:hAnsi="Arial"/>
+                <w:sz w:val="22"/>
+                <w:color w:val="000000"/>
+              </w:rPr>
+              <w:t>{{ board_chair_name }}</w:t>
             </w:r>
           </w:p>
         </w:tc>
@@ -2064,6 +2185,7 @@
                 <w:bCs/>
                 <w:i/>
                 <w:color w:val="008000"/>
+                <w:sz w:val="20"/>
               </w:rPr>
               <w:t>İmza</w:t>
             </w:r>
@@ -2093,6 +2215,7 @@
                 <w:bCs/>
                 <w:i/>
                 <w:color w:val="008000"/>
+                <w:sz w:val="20"/>
               </w:rPr>
               <w:t>Paraf</w:t>
             </w:r>
@@ -2101,7 +2224,8 @@
       </w:tr>
       <w:tr>
         <w:trPr>
-          <w:trHeight w:val="737"/>
+          <w:trHeight w:val="600" w:hRule="atLeast"/>
+          <w:cantSplit/>
         </w:trPr>
         <w:tc>
           <w:tcPr>
@@ -2149,6 +2273,7 @@
                 <w:rFonts w:asciiTheme="minorHAnsi" w:hAnsiTheme="minorHAnsi" w:cs="Arial"/>
                 <w:bCs/>
                 <w:color w:val="000000"/>
+                <w:sz w:val="20"/>
               </w:rPr>
               <w:t>PSK</w:t>
             </w:r>
@@ -2174,12 +2299,11 @@
             </w:pPr>
             <w:r>
               <w:rPr>
-                <w:rFonts w:asciiTheme="minorHAnsi" w:hAnsiTheme="minorHAnsi" w:cs="Arial"/>
-                <w:bCs/>
-                <w:i/>
-                <w:color w:val="008000"/>
-              </w:rPr>
-              <w:t>Ad Soyad</w:t>
+                <w:rFonts w:ascii="Arial" w:hAnsi="Arial"/>
+                <w:sz w:val="22"/>
+                <w:color w:val="000000"/>
+              </w:rPr>
+              <w:t>{{ board_psk_name }}</w:t>
             </w:r>
           </w:p>
         </w:tc>
@@ -2207,6 +2331,7 @@
                 <w:bCs/>
                 <w:i/>
                 <w:color w:val="008000"/>
+                <w:sz w:val="20"/>
               </w:rPr>
               <w:t>İmza</w:t>
             </w:r>
@@ -2236,6 +2361,7 @@
                 <w:bCs/>
                 <w:i/>
                 <w:color w:val="008000"/>
+                <w:sz w:val="20"/>
               </w:rPr>
               <w:t>Paraf</w:t>
             </w:r>
@@ -2244,7 +2370,8 @@
       </w:tr>
       <w:tr>
         <w:trPr>
-          <w:trHeight w:val="737"/>
+          <w:trHeight w:val="600" w:hRule="atLeast"/>
+          <w:cantSplit/>
         </w:trPr>
         <w:tc>
           <w:tcPr>
@@ -2292,6 +2419,7 @@
                 <w:rFonts w:asciiTheme="minorHAnsi" w:hAnsiTheme="minorHAnsi" w:cs="Arial"/>
                 <w:bCs/>
                 <w:color w:val="000000"/>
+                <w:sz w:val="20"/>
               </w:rPr>
               <w:t>Üye</w:t>
             </w:r>
@@ -2317,12 +2445,11 @@
             </w:pPr>
             <w:r>
               <w:rPr>
-                <w:rFonts w:asciiTheme="minorHAnsi" w:hAnsiTheme="minorHAnsi" w:cs="Arial"/>
-                <w:bCs/>
-                <w:i/>
-                <w:color w:val="008000"/>
-              </w:rPr>
-              <w:t>Ad Soyad</w:t>
+                <w:rFonts w:ascii="Arial" w:hAnsi="Arial"/>
+                <w:sz w:val="22"/>
+                <w:color w:val="000000"/>
+              </w:rPr>
+              <w:t>{{ board_member_names[0] }}</w:t>
             </w:r>
           </w:p>
         </w:tc>
@@ -2350,6 +2477,7 @@
                 <w:bCs/>
                 <w:i/>
                 <w:color w:val="008000"/>
+                <w:sz w:val="20"/>
               </w:rPr>
               <w:t>İmza</w:t>
             </w:r>
@@ -2379,6 +2507,7 @@
                 <w:bCs/>
                 <w:i/>
                 <w:color w:val="008000"/>
+                <w:sz w:val="20"/>
               </w:rPr>
               <w:t>Paraf</w:t>
             </w:r>
@@ -2387,7 +2516,8 @@
       </w:tr>
       <w:tr>
         <w:trPr>
-          <w:trHeight w:val="737"/>
+          <w:trHeight w:val="600" w:hRule="atLeast"/>
+          <w:cantSplit/>
         </w:trPr>
         <w:tc>
           <w:tcPr>
@@ -2435,6 +2565,7 @@
                 <w:rFonts w:asciiTheme="minorHAnsi" w:hAnsiTheme="minorHAnsi" w:cs="Arial"/>
                 <w:bCs/>
                 <w:color w:val="000000"/>
+                <w:sz w:val="20"/>
               </w:rPr>
               <w:t>Üye</w:t>
             </w:r>
@@ -2460,12 +2591,11 @@
             </w:pPr>
             <w:r>
               <w:rPr>
-                <w:rFonts w:asciiTheme="minorHAnsi" w:hAnsiTheme="minorHAnsi" w:cs="Arial"/>
-                <w:bCs/>
-                <w:i/>
-                <w:color w:val="008000"/>
-              </w:rPr>
-              <w:t>Ad Soyad</w:t>
+                <w:rFonts w:ascii="Arial" w:hAnsi="Arial"/>
+                <w:sz w:val="22"/>
+                <w:color w:val="000000"/>
+              </w:rPr>
+              <w:t>{{ board_member_names[1] }}</w:t>
             </w:r>
           </w:p>
         </w:tc>
@@ -2493,6 +2623,7 @@
                 <w:bCs/>
                 <w:i/>
                 <w:color w:val="008000"/>
+                <w:sz w:val="20"/>
               </w:rPr>
               <w:t>İmza</w:t>
             </w:r>
@@ -2522,6 +2653,7 @@
                 <w:bCs/>
                 <w:i/>
                 <w:color w:val="008000"/>
+                <w:sz w:val="20"/>
               </w:rPr>
               <w:t>Paraf</w:t>
             </w:r>
@@ -2530,7 +2662,8 @@
       </w:tr>
       <w:tr>
         <w:trPr>
-          <w:trHeight w:val="737"/>
+          <w:trHeight w:val="600" w:hRule="atLeast"/>
+          <w:cantSplit/>
         </w:trPr>
         <w:tc>
           <w:tcPr>
@@ -2578,6 +2711,7 @@
                 <w:rFonts w:asciiTheme="minorHAnsi" w:hAnsiTheme="minorHAnsi" w:cs="Arial"/>
                 <w:bCs/>
                 <w:color w:val="000000"/>
+                <w:sz w:val="20"/>
               </w:rPr>
               <w:t>Üye</w:t>
             </w:r>
@@ -2603,12 +2737,11 @@
             </w:pPr>
             <w:r>
               <w:rPr>
-                <w:rFonts w:asciiTheme="minorHAnsi" w:hAnsiTheme="minorHAnsi" w:cs="Arial"/>
-                <w:bCs/>
-                <w:i/>
-                <w:color w:val="008000"/>
-              </w:rPr>
-              <w:t>Ad Soyad</w:t>
+                <w:rFonts w:ascii="Arial" w:hAnsi="Arial"/>
+                <w:sz w:val="22"/>
+                <w:color w:val="000000"/>
+              </w:rPr>
+              <w:t>{{ board_member_names[2] }}</w:t>
             </w:r>
           </w:p>
         </w:tc>
@@ -2636,6 +2769,7 @@
                 <w:bCs/>
                 <w:i/>
                 <w:color w:val="008000"/>
+                <w:sz w:val="20"/>
               </w:rPr>
               <w:t>İmza</w:t>
             </w:r>
@@ -2665,6 +2799,7 @@
                 <w:bCs/>
                 <w:i/>
                 <w:color w:val="008000"/>
+                <w:sz w:val="20"/>
               </w:rPr>
               <w:t>Paraf</w:t>
             </w:r>
@@ -2673,7 +2808,8 @@
       </w:tr>
       <w:tr>
         <w:trPr>
-          <w:trHeight w:val="737"/>
+          <w:trHeight w:val="600" w:hRule="atLeast"/>
+          <w:cantSplit/>
         </w:trPr>
         <w:tc>
           <w:tcPr>
@@ -2721,6 +2857,7 @@
                 <w:rFonts w:asciiTheme="minorHAnsi" w:hAnsiTheme="minorHAnsi" w:cs="Arial"/>
                 <w:bCs/>
                 <w:color w:val="000000"/>
+                <w:sz w:val="20"/>
               </w:rPr>
               <w:t>Üye</w:t>
             </w:r>
@@ -2746,12 +2883,11 @@
             </w:pPr>
             <w:r>
               <w:rPr>
-                <w:rFonts w:asciiTheme="minorHAnsi" w:hAnsiTheme="minorHAnsi" w:cs="Arial"/>
-                <w:bCs/>
-                <w:i/>
-                <w:color w:val="008000"/>
-              </w:rPr>
-              <w:t>Ad Soyad</w:t>
+                <w:rFonts w:ascii="Arial" w:hAnsi="Arial"/>
+                <w:sz w:val="22"/>
+                <w:color w:val="000000"/>
+              </w:rPr>
+              <w:t>{{ board_member_names[3] }}</w:t>
             </w:r>
           </w:p>
         </w:tc>
@@ -2779,6 +2915,7 @@
                 <w:bCs/>
                 <w:i/>
                 <w:color w:val="008000"/>
+                <w:sz w:val="20"/>
               </w:rPr>
               <w:t>İmza</w:t>
             </w:r>
@@ -2808,6 +2945,7 @@
                 <w:bCs/>
                 <w:i/>
                 <w:color w:val="008000"/>
+                <w:sz w:val="20"/>
               </w:rPr>
               <w:t>Paraf</w:t>
             </w:r>
@@ -2817,6 +2955,7 @@
       <w:tr>
         <w:trPr>
           <w:trHeight w:val="373"/>
+          <w:cantSplit/>
         </w:trPr>
         <w:tc>
           <w:tcPr>
@@ -2899,12 +3038,21 @@
                 <w:szCs w:val="20"/>
               </w:rPr>
             </w:pPr>
+            <w:r>
+              <w:rPr>
+                <w:rFonts w:ascii="Arial" w:hAnsi="Arial"/>
+                <w:sz w:val="22"/>
+                <w:color w:val="000000"/>
+              </w:rPr>
+              <w:t>{{ validity_display }}</w:t>
+            </w:r>
           </w:p>
         </w:tc>
       </w:tr>
       <w:tr>
         <w:trPr>
           <w:trHeight w:val="373"/>
+          <w:cantSplit/>
         </w:trPr>
         <w:tc>
           <w:tcPr>
@@ -3018,6 +3166,14 @@
                 <w:szCs w:val="20"/>
               </w:rPr>
             </w:pPr>
+            <w:r>
+              <w:rPr>
+                <w:rFonts w:ascii="Arial" w:hAnsi="Arial"/>
+                <w:sz w:val="22"/>
+                <w:color w:val="000000"/>
+              </w:rPr>
+              <w:t>{{ permit_issue_date_display }}</w:t>
+            </w:r>
           </w:p>
         </w:tc>
       </w:tr>

</xml_diff>